<commit_message>
README, logo y ficha actualizada
</commit_message>
<xml_diff>
--- a/docs/Ficha_tecnica_LOS_DECEPTICONS.docx
+++ b/docs/Ficha_tecnica_LOS_DECEPTICONS.docx
@@ -135,7 +135,7 @@
           <w:szCs w:val="20"/>
           <w:lang w:val="es-ES"/>
         </w:rPr>
-        <w:t xml:space="preserve"> Pendiente (repositorio en creación)</w:t>
+        <w:t xml:space="preserve"> https://github.com/diegobastianelli/LOS-DECEPTICONS-minisumo</w:t>
       </w:r>
     </w:p>
     <w:p>
@@ -329,7 +329,7 @@
                 <w:szCs w:val="20"/>
                 <w:lang w:val="es-ES"/>
               </w:rPr>
-              <w:t xml:space="preserve">10 x 10 x [pendiente] cm (máximo de diseño, estimado)</w:t>
+              <w:t xml:space="preserve">10 x 10 x 6–8 cm (máximo de diseño, estimado)</w:t>
             </w:r>
           </w:p>
         </w:tc>
@@ -4113,7 +4113,7 @@
                 <w:szCs w:val="20"/>
                 <w:lang w:val="es-ES"/>
               </w:rPr>
-              <w:t xml:space="preserve">[ ] CUMPLE</w:t>
+              <w:t xml:space="preserve">[X] CUMPLE</w:t>
             </w:r>
           </w:p>
           <w:p>

</xml_diff>